<commit_message>
Update Update user ccount use-case.docx
</commit_message>
<xml_diff>
--- a/Administrator Use cases/Update user ccount use-case.docx
+++ b/Administrator Use cases/Update user ccount use-case.docx
@@ -410,6 +410,26 @@
                 <w:szCs w:val="28"/>
               </w:rPr>
               <w:t>Step 6: System updates the user information.</w:t>
+            </w:r>
+          </w:p>
+          <w:p>
+            <w:pPr>
+              <w:pStyle w:val="NormalWeb"/>
+              <w:numPr>
+                <w:ilvl w:val="0"/>
+                <w:numId w:val="2"/>
+              </w:numPr>
+              <w:rPr>
+                <w:sz w:val="28"/>
+                <w:szCs w:val="28"/>
+              </w:rPr>
+            </w:pPr>
+            <w:r>
+              <w:rPr>
+                <w:sz w:val="28"/>
+                <w:szCs w:val="28"/>
+              </w:rPr>
+              <w:t>Step 7: System displays message to the user.</w:t>
             </w:r>
           </w:p>
         </w:tc>

</xml_diff>